<commit_message>
Add the age-distribution data (slide 8) as a table in the minuta
Section 4 ("Lo que sabemos") now presents the Censo 2024 age-tramo
breakdown as an actual 3-column table (tramo etario / población /
porcentaje) instead of a flat bullet list, so slide 8's cifras read
clearly as their own distinct block within that section.

Co-Authored-By: Claude Sonnet 5 <noreply@anthropic.com>
Claude-Session: https://claude.ai/code/session_01UCEkpXJeXiJNdtVTMN97wz
</commit_message>
<xml_diff>
--- a/Minuta_Agenda_Intergeneracional.docx
+++ b/Minuta_Agenda_Intergeneracional.docx
@@ -713,127 +713,624 @@
           <w:szCs w:val="22"/>
           <w:rtl w:val="0"/>
         </w:rPr>
-        <w:t xml:space="preserve">Cifras clave (Censo 2024, Providencia):</w:t>
-      </w:r>
-    </w:p>
-    <w:p>
-      <w:pPr>
-        <w:numPr>
-          <w:ilvl w:val="0"/>
-          <w:numId w:val="1"/>
-        </w:numPr>
-        <w:spacing w:after="60" w:line="259" w:lineRule="auto"/>
-        <w:ind w:left="720" w:hanging="360"/>
-        <w:rPr>
-          <w:rFonts w:ascii="Raleway" w:cs="Raleway" w:eastAsia="Raleway" w:hAnsi="Raleway"/>
-          <w:sz w:val="22"/>
-          <w:szCs w:val="22"/>
-        </w:rPr>
-      </w:pPr>
-      <w:r>
-        <w:rPr>
-          <w:rFonts w:ascii="Raleway" w:cs="Raleway" w:eastAsia="Raleway" w:hAnsi="Raleway"/>
-          <w:sz w:val="22"/>
-          <w:szCs w:val="22"/>
-          <w:rtl w:val="0"/>
-        </w:rPr>
-        <w:t xml:space="preserve">0 a 14 años — 17.123 personas · 11,9%</w:t>
-      </w:r>
-    </w:p>
-    <w:p>
-      <w:pPr>
-        <w:numPr>
-          <w:ilvl w:val="0"/>
-          <w:numId w:val="1"/>
-        </w:numPr>
-        <w:spacing w:after="60" w:line="259" w:lineRule="auto"/>
-        <w:ind w:left="720" w:hanging="360"/>
-        <w:rPr>
-          <w:rFonts w:ascii="Raleway" w:cs="Raleway" w:eastAsia="Raleway" w:hAnsi="Raleway"/>
-          <w:sz w:val="22"/>
-          <w:szCs w:val="22"/>
-        </w:rPr>
-      </w:pPr>
-      <w:r>
-        <w:rPr>
-          <w:rFonts w:ascii="Raleway" w:cs="Raleway" w:eastAsia="Raleway" w:hAnsi="Raleway"/>
-          <w:sz w:val="22"/>
-          <w:szCs w:val="22"/>
-          <w:rtl w:val="0"/>
-        </w:rPr>
-        <w:t xml:space="preserve">15 a 29 años ("Jóvenes") — 26.722 personas · 18,6%</w:t>
-      </w:r>
-    </w:p>
-    <w:p>
-      <w:pPr>
-        <w:numPr>
-          <w:ilvl w:val="0"/>
-          <w:numId w:val="1"/>
-        </w:numPr>
-        <w:spacing w:after="60" w:line="259" w:lineRule="auto"/>
-        <w:ind w:left="720" w:hanging="360"/>
-        <w:rPr>
-          <w:rFonts w:ascii="Raleway" w:cs="Raleway" w:eastAsia="Raleway" w:hAnsi="Raleway"/>
-          <w:sz w:val="22"/>
-          <w:szCs w:val="22"/>
-        </w:rPr>
-      </w:pPr>
-      <w:r>
-        <w:rPr>
-          <w:rFonts w:ascii="Raleway" w:cs="Raleway" w:eastAsia="Raleway" w:hAnsi="Raleway"/>
-          <w:sz w:val="22"/>
-          <w:szCs w:val="22"/>
-          <w:rtl w:val="0"/>
-        </w:rPr>
-        <w:t xml:space="preserve">30 a 44 años — 45.167 personas · 31,4%</w:t>
-      </w:r>
-    </w:p>
-    <w:p>
-      <w:pPr>
-        <w:numPr>
-          <w:ilvl w:val="0"/>
-          <w:numId w:val="1"/>
-        </w:numPr>
-        <w:spacing w:after="60" w:line="259" w:lineRule="auto"/>
-        <w:ind w:left="720" w:hanging="360"/>
-        <w:rPr>
-          <w:rFonts w:ascii="Raleway" w:cs="Raleway" w:eastAsia="Raleway" w:hAnsi="Raleway"/>
-          <w:sz w:val="22"/>
-          <w:szCs w:val="22"/>
-        </w:rPr>
-      </w:pPr>
-      <w:r>
-        <w:rPr>
-          <w:rFonts w:ascii="Raleway" w:cs="Raleway" w:eastAsia="Raleway" w:hAnsi="Raleway"/>
-          <w:sz w:val="22"/>
-          <w:szCs w:val="22"/>
-          <w:rtl w:val="0"/>
-        </w:rPr>
-        <w:t xml:space="preserve">45 a 64 años — 31.857 personas · 22,1%</w:t>
-      </w:r>
-    </w:p>
-    <w:p>
-      <w:pPr>
-        <w:numPr>
-          <w:ilvl w:val="0"/>
-          <w:numId w:val="1"/>
-        </w:numPr>
-        <w:spacing w:after="60" w:line="259" w:lineRule="auto"/>
-        <w:ind w:left="720" w:hanging="360"/>
-        <w:rPr>
-          <w:rFonts w:ascii="Raleway" w:cs="Raleway" w:eastAsia="Raleway" w:hAnsi="Raleway"/>
-          <w:sz w:val="22"/>
-          <w:szCs w:val="22"/>
-        </w:rPr>
-      </w:pPr>
-      <w:r>
-        <w:rPr>
-          <w:rFonts w:ascii="Raleway" w:cs="Raleway" w:eastAsia="Raleway" w:hAnsi="Raleway"/>
-          <w:sz w:val="22"/>
-          <w:szCs w:val="22"/>
-          <w:rtl w:val="0"/>
-        </w:rPr>
-        <w:t xml:space="preserve">65 años y más ("Mayores") — 23.105 personas · 16,0%</w:t>
+        <w:t xml:space="preserve">Cifras clave — distribución de la población por tramo de edad (Censo 2024, Providencia):</w:t>
+      </w:r>
+    </w:p>
+    <w:tbl>
+      <w:tblPr>
+        <w:tblW w:w="8500" w:type="dxa"/>
+        <w:tblBorders>
+          <w:top w:val="single" w:sz="4" w:space="0" w:color="999999"/>
+          <w:left w:val="single" w:sz="4" w:space="0" w:color="999999"/>
+          <w:bottom w:val="single" w:sz="4" w:space="0" w:color="999999"/>
+          <w:right w:val="single" w:sz="4" w:space="0" w:color="999999"/>
+          <w:insideH w:val="single" w:sz="4" w:space="0" w:color="999999"/>
+          <w:insideV w:val="single" w:sz="4" w:space="0" w:color="999999"/>
+        </w:tblBorders>
+        <w:tblLook w:val="0000" w:firstRow="0" w:lastRow="0" w:firstColumn="0" w:lastColumn="0" w:noHBand="0" w:noVBand="0"/>
+      </w:tblPr>
+      <w:tblGrid>
+        <w:gridCol w:w="4500"/>
+        <w:gridCol w:w="2000"/>
+        <w:gridCol w:w="2000"/>
+      </w:tblGrid>
+      <w:tr>
+        <w:tc>
+          <w:tcPr>
+            <w:tcW w:w="4500" w:type="dxa"/>
+            <w:tcBorders>
+              <w:top w:val="single" w:sz="4" w:space="0" w:color="999999"/>
+              <w:left w:val="single" w:sz="4" w:space="0" w:color="999999"/>
+              <w:bottom w:val="single" w:sz="4" w:space="0" w:color="999999"/>
+              <w:right w:val="single" w:sz="4" w:space="0" w:color="999999"/>
+            </w:tcBorders>
+            <w:shd w:val="clear" w:color="auto" w:fill="EAE0D0"/>
+            <w:vAlign w:val="center"/>
+          </w:tcPr>
+          <w:p>
+            <w:pPr>
+              <w:spacing w:after="0" w:line="259" w:lineRule="auto"/>
+              <w:rPr>
+                <w:rFonts w:ascii="Raleway" w:cs="Raleway" w:eastAsia="Raleway" w:hAnsi="Raleway"/>
+                <w:sz w:val="22"/>
+                <w:szCs w:val="22"/>
+              </w:rPr>
+            </w:pPr>
+            <w:r>
+              <w:rPr>
+                <w:rFonts w:ascii="Raleway" w:cs="Raleway" w:eastAsia="Raleway" w:hAnsi="Raleway"/>
+                <w:b w:val="1"/>
+                <w:bCs w:val="1"/>
+                <w:sz w:val="22"/>
+                <w:szCs w:val="22"/>
+                <w:rtl w:val="0"/>
+              </w:rPr>
+              <w:t xml:space="preserve">Tramo etario</w:t>
+            </w:r>
+          </w:p>
+        </w:tc>
+        <w:tc>
+          <w:tcPr>
+            <w:tcW w:w="2000" w:type="dxa"/>
+            <w:tcBorders>
+              <w:top w:val="single" w:sz="4" w:space="0" w:color="999999"/>
+              <w:left w:val="single" w:sz="4" w:space="0" w:color="999999"/>
+              <w:bottom w:val="single" w:sz="4" w:space="0" w:color="999999"/>
+              <w:right w:val="single" w:sz="4" w:space="0" w:color="999999"/>
+            </w:tcBorders>
+            <w:shd w:val="clear" w:color="auto" w:fill="EAE0D0"/>
+            <w:vAlign w:val="center"/>
+          </w:tcPr>
+          <w:p>
+            <w:pPr>
+              <w:spacing w:after="0" w:line="259" w:lineRule="auto"/>
+              <w:rPr>
+                <w:rFonts w:ascii="Raleway" w:cs="Raleway" w:eastAsia="Raleway" w:hAnsi="Raleway"/>
+                <w:sz w:val="22"/>
+                <w:szCs w:val="22"/>
+              </w:rPr>
+            </w:pPr>
+            <w:r>
+              <w:rPr>
+                <w:rFonts w:ascii="Raleway" w:cs="Raleway" w:eastAsia="Raleway" w:hAnsi="Raleway"/>
+                <w:b w:val="1"/>
+                <w:bCs w:val="1"/>
+                <w:sz w:val="22"/>
+                <w:szCs w:val="22"/>
+                <w:rtl w:val="0"/>
+              </w:rPr>
+              <w:t xml:space="preserve">Población</w:t>
+            </w:r>
+          </w:p>
+        </w:tc>
+        <w:tc>
+          <w:tcPr>
+            <w:tcW w:w="2000" w:type="dxa"/>
+            <w:tcBorders>
+              <w:top w:val="single" w:sz="4" w:space="0" w:color="999999"/>
+              <w:left w:val="single" w:sz="4" w:space="0" w:color="999999"/>
+              <w:bottom w:val="single" w:sz="4" w:space="0" w:color="999999"/>
+              <w:right w:val="single" w:sz="4" w:space="0" w:color="999999"/>
+            </w:tcBorders>
+            <w:shd w:val="clear" w:color="auto" w:fill="EAE0D0"/>
+            <w:vAlign w:val="center"/>
+          </w:tcPr>
+          <w:p>
+            <w:pPr>
+              <w:spacing w:after="0" w:line="259" w:lineRule="auto"/>
+              <w:rPr>
+                <w:rFonts w:ascii="Raleway" w:cs="Raleway" w:eastAsia="Raleway" w:hAnsi="Raleway"/>
+                <w:sz w:val="22"/>
+                <w:szCs w:val="22"/>
+              </w:rPr>
+            </w:pPr>
+            <w:r>
+              <w:rPr>
+                <w:rFonts w:ascii="Raleway" w:cs="Raleway" w:eastAsia="Raleway" w:hAnsi="Raleway"/>
+                <w:b w:val="1"/>
+                <w:bCs w:val="1"/>
+                <w:sz w:val="22"/>
+                <w:szCs w:val="22"/>
+                <w:rtl w:val="0"/>
+              </w:rPr>
+              <w:t xml:space="preserve">Porcentaje</w:t>
+            </w:r>
+          </w:p>
+        </w:tc>
+      </w:tr>
+      <w:tr>
+        <w:tc>
+          <w:tcPr>
+            <w:tcW w:w="4500" w:type="dxa"/>
+            <w:tcBorders>
+              <w:top w:val="single" w:sz="4" w:space="0" w:color="999999"/>
+              <w:left w:val="single" w:sz="4" w:space="0" w:color="999999"/>
+              <w:bottom w:val="single" w:sz="4" w:space="0" w:color="999999"/>
+              <w:right w:val="single" w:sz="4" w:space="0" w:color="999999"/>
+            </w:tcBorders>
+            <w:vAlign w:val="center"/>
+          </w:tcPr>
+          <w:p>
+            <w:pPr>
+              <w:spacing w:after="0" w:line="259" w:lineRule="auto"/>
+              <w:rPr>
+                <w:rFonts w:ascii="Raleway" w:cs="Raleway" w:eastAsia="Raleway" w:hAnsi="Raleway"/>
+                <w:sz w:val="22"/>
+                <w:szCs w:val="22"/>
+              </w:rPr>
+            </w:pPr>
+            <w:r>
+              <w:rPr>
+                <w:rFonts w:ascii="Raleway" w:cs="Raleway" w:eastAsia="Raleway" w:hAnsi="Raleway"/>
+                <w:sz w:val="22"/>
+                <w:szCs w:val="22"/>
+                <w:rtl w:val="0"/>
+              </w:rPr>
+              <w:t xml:space="preserve">0 a 14 años</w:t>
+            </w:r>
+          </w:p>
+        </w:tc>
+        <w:tc>
+          <w:tcPr>
+            <w:tcW w:w="2000" w:type="dxa"/>
+            <w:tcBorders>
+              <w:top w:val="single" w:sz="4" w:space="0" w:color="999999"/>
+              <w:left w:val="single" w:sz="4" w:space="0" w:color="999999"/>
+              <w:bottom w:val="single" w:sz="4" w:space="0" w:color="999999"/>
+              <w:right w:val="single" w:sz="4" w:space="0" w:color="999999"/>
+            </w:tcBorders>
+            <w:vAlign w:val="center"/>
+          </w:tcPr>
+          <w:p>
+            <w:pPr>
+              <w:spacing w:after="0" w:line="259" w:lineRule="auto"/>
+              <w:rPr>
+                <w:rFonts w:ascii="Raleway" w:cs="Raleway" w:eastAsia="Raleway" w:hAnsi="Raleway"/>
+                <w:sz w:val="22"/>
+                <w:szCs w:val="22"/>
+              </w:rPr>
+            </w:pPr>
+            <w:r>
+              <w:rPr>
+                <w:rFonts w:ascii="Raleway" w:cs="Raleway" w:eastAsia="Raleway" w:hAnsi="Raleway"/>
+                <w:sz w:val="22"/>
+                <w:szCs w:val="22"/>
+                <w:rtl w:val="0"/>
+              </w:rPr>
+              <w:t xml:space="preserve">17.123</w:t>
+            </w:r>
+          </w:p>
+        </w:tc>
+        <w:tc>
+          <w:tcPr>
+            <w:tcW w:w="2000" w:type="dxa"/>
+            <w:tcBorders>
+              <w:top w:val="single" w:sz="4" w:space="0" w:color="999999"/>
+              <w:left w:val="single" w:sz="4" w:space="0" w:color="999999"/>
+              <w:bottom w:val="single" w:sz="4" w:space="0" w:color="999999"/>
+              <w:right w:val="single" w:sz="4" w:space="0" w:color="999999"/>
+            </w:tcBorders>
+            <w:vAlign w:val="center"/>
+          </w:tcPr>
+          <w:p>
+            <w:pPr>
+              <w:spacing w:after="0" w:line="259" w:lineRule="auto"/>
+              <w:rPr>
+                <w:rFonts w:ascii="Raleway" w:cs="Raleway" w:eastAsia="Raleway" w:hAnsi="Raleway"/>
+                <w:sz w:val="22"/>
+                <w:szCs w:val="22"/>
+              </w:rPr>
+            </w:pPr>
+            <w:r>
+              <w:rPr>
+                <w:rFonts w:ascii="Raleway" w:cs="Raleway" w:eastAsia="Raleway" w:hAnsi="Raleway"/>
+                <w:sz w:val="22"/>
+                <w:szCs w:val="22"/>
+                <w:rtl w:val="0"/>
+              </w:rPr>
+              <w:t xml:space="preserve">11,9%</w:t>
+            </w:r>
+          </w:p>
+        </w:tc>
+      </w:tr>
+      <w:tr>
+        <w:tc>
+          <w:tcPr>
+            <w:tcW w:w="4500" w:type="dxa"/>
+            <w:tcBorders>
+              <w:top w:val="single" w:sz="4" w:space="0" w:color="999999"/>
+              <w:left w:val="single" w:sz="4" w:space="0" w:color="999999"/>
+              <w:bottom w:val="single" w:sz="4" w:space="0" w:color="999999"/>
+              <w:right w:val="single" w:sz="4" w:space="0" w:color="999999"/>
+            </w:tcBorders>
+            <w:vAlign w:val="center"/>
+          </w:tcPr>
+          <w:p>
+            <w:pPr>
+              <w:spacing w:after="0" w:line="259" w:lineRule="auto"/>
+              <w:rPr>
+                <w:rFonts w:ascii="Raleway" w:cs="Raleway" w:eastAsia="Raleway" w:hAnsi="Raleway"/>
+                <w:sz w:val="22"/>
+                <w:szCs w:val="22"/>
+              </w:rPr>
+            </w:pPr>
+            <w:r>
+              <w:rPr>
+                <w:rFonts w:ascii="Raleway" w:cs="Raleway" w:eastAsia="Raleway" w:hAnsi="Raleway"/>
+                <w:sz w:val="22"/>
+                <w:szCs w:val="22"/>
+                <w:rtl w:val="0"/>
+              </w:rPr>
+              <w:t xml:space="preserve">15 a 29 años (Jóvenes)</w:t>
+            </w:r>
+          </w:p>
+        </w:tc>
+        <w:tc>
+          <w:tcPr>
+            <w:tcW w:w="2000" w:type="dxa"/>
+            <w:tcBorders>
+              <w:top w:val="single" w:sz="4" w:space="0" w:color="999999"/>
+              <w:left w:val="single" w:sz="4" w:space="0" w:color="999999"/>
+              <w:bottom w:val="single" w:sz="4" w:space="0" w:color="999999"/>
+              <w:right w:val="single" w:sz="4" w:space="0" w:color="999999"/>
+            </w:tcBorders>
+            <w:vAlign w:val="center"/>
+          </w:tcPr>
+          <w:p>
+            <w:pPr>
+              <w:spacing w:after="0" w:line="259" w:lineRule="auto"/>
+              <w:rPr>
+                <w:rFonts w:ascii="Raleway" w:cs="Raleway" w:eastAsia="Raleway" w:hAnsi="Raleway"/>
+                <w:sz w:val="22"/>
+                <w:szCs w:val="22"/>
+              </w:rPr>
+            </w:pPr>
+            <w:r>
+              <w:rPr>
+                <w:rFonts w:ascii="Raleway" w:cs="Raleway" w:eastAsia="Raleway" w:hAnsi="Raleway"/>
+                <w:sz w:val="22"/>
+                <w:szCs w:val="22"/>
+                <w:rtl w:val="0"/>
+              </w:rPr>
+              <w:t xml:space="preserve">26.722</w:t>
+            </w:r>
+          </w:p>
+        </w:tc>
+        <w:tc>
+          <w:tcPr>
+            <w:tcW w:w="2000" w:type="dxa"/>
+            <w:tcBorders>
+              <w:top w:val="single" w:sz="4" w:space="0" w:color="999999"/>
+              <w:left w:val="single" w:sz="4" w:space="0" w:color="999999"/>
+              <w:bottom w:val="single" w:sz="4" w:space="0" w:color="999999"/>
+              <w:right w:val="single" w:sz="4" w:space="0" w:color="999999"/>
+            </w:tcBorders>
+            <w:vAlign w:val="center"/>
+          </w:tcPr>
+          <w:p>
+            <w:pPr>
+              <w:spacing w:after="0" w:line="259" w:lineRule="auto"/>
+              <w:rPr>
+                <w:rFonts w:ascii="Raleway" w:cs="Raleway" w:eastAsia="Raleway" w:hAnsi="Raleway"/>
+                <w:sz w:val="22"/>
+                <w:szCs w:val="22"/>
+              </w:rPr>
+            </w:pPr>
+            <w:r>
+              <w:rPr>
+                <w:rFonts w:ascii="Raleway" w:cs="Raleway" w:eastAsia="Raleway" w:hAnsi="Raleway"/>
+                <w:sz w:val="22"/>
+                <w:szCs w:val="22"/>
+                <w:rtl w:val="0"/>
+              </w:rPr>
+              <w:t xml:space="preserve">18,6%</w:t>
+            </w:r>
+          </w:p>
+        </w:tc>
+      </w:tr>
+      <w:tr>
+        <w:tc>
+          <w:tcPr>
+            <w:tcW w:w="4500" w:type="dxa"/>
+            <w:tcBorders>
+              <w:top w:val="single" w:sz="4" w:space="0" w:color="999999"/>
+              <w:left w:val="single" w:sz="4" w:space="0" w:color="999999"/>
+              <w:bottom w:val="single" w:sz="4" w:space="0" w:color="999999"/>
+              <w:right w:val="single" w:sz="4" w:space="0" w:color="999999"/>
+            </w:tcBorders>
+            <w:vAlign w:val="center"/>
+          </w:tcPr>
+          <w:p>
+            <w:pPr>
+              <w:spacing w:after="0" w:line="259" w:lineRule="auto"/>
+              <w:rPr>
+                <w:rFonts w:ascii="Raleway" w:cs="Raleway" w:eastAsia="Raleway" w:hAnsi="Raleway"/>
+                <w:sz w:val="22"/>
+                <w:szCs w:val="22"/>
+              </w:rPr>
+            </w:pPr>
+            <w:r>
+              <w:rPr>
+                <w:rFonts w:ascii="Raleway" w:cs="Raleway" w:eastAsia="Raleway" w:hAnsi="Raleway"/>
+                <w:sz w:val="22"/>
+                <w:szCs w:val="22"/>
+                <w:rtl w:val="0"/>
+              </w:rPr>
+              <w:t xml:space="preserve">30 a 44 años</w:t>
+            </w:r>
+          </w:p>
+        </w:tc>
+        <w:tc>
+          <w:tcPr>
+            <w:tcW w:w="2000" w:type="dxa"/>
+            <w:tcBorders>
+              <w:top w:val="single" w:sz="4" w:space="0" w:color="999999"/>
+              <w:left w:val="single" w:sz="4" w:space="0" w:color="999999"/>
+              <w:bottom w:val="single" w:sz="4" w:space="0" w:color="999999"/>
+              <w:right w:val="single" w:sz="4" w:space="0" w:color="999999"/>
+            </w:tcBorders>
+            <w:vAlign w:val="center"/>
+          </w:tcPr>
+          <w:p>
+            <w:pPr>
+              <w:spacing w:after="0" w:line="259" w:lineRule="auto"/>
+              <w:rPr>
+                <w:rFonts w:ascii="Raleway" w:cs="Raleway" w:eastAsia="Raleway" w:hAnsi="Raleway"/>
+                <w:sz w:val="22"/>
+                <w:szCs w:val="22"/>
+              </w:rPr>
+            </w:pPr>
+            <w:r>
+              <w:rPr>
+                <w:rFonts w:ascii="Raleway" w:cs="Raleway" w:eastAsia="Raleway" w:hAnsi="Raleway"/>
+                <w:sz w:val="22"/>
+                <w:szCs w:val="22"/>
+                <w:rtl w:val="0"/>
+              </w:rPr>
+              <w:t xml:space="preserve">45.167</w:t>
+            </w:r>
+          </w:p>
+        </w:tc>
+        <w:tc>
+          <w:tcPr>
+            <w:tcW w:w="2000" w:type="dxa"/>
+            <w:tcBorders>
+              <w:top w:val="single" w:sz="4" w:space="0" w:color="999999"/>
+              <w:left w:val="single" w:sz="4" w:space="0" w:color="999999"/>
+              <w:bottom w:val="single" w:sz="4" w:space="0" w:color="999999"/>
+              <w:right w:val="single" w:sz="4" w:space="0" w:color="999999"/>
+            </w:tcBorders>
+            <w:vAlign w:val="center"/>
+          </w:tcPr>
+          <w:p>
+            <w:pPr>
+              <w:spacing w:after="0" w:line="259" w:lineRule="auto"/>
+              <w:rPr>
+                <w:rFonts w:ascii="Raleway" w:cs="Raleway" w:eastAsia="Raleway" w:hAnsi="Raleway"/>
+                <w:sz w:val="22"/>
+                <w:szCs w:val="22"/>
+              </w:rPr>
+            </w:pPr>
+            <w:r>
+              <w:rPr>
+                <w:rFonts w:ascii="Raleway" w:cs="Raleway" w:eastAsia="Raleway" w:hAnsi="Raleway"/>
+                <w:sz w:val="22"/>
+                <w:szCs w:val="22"/>
+                <w:rtl w:val="0"/>
+              </w:rPr>
+              <w:t xml:space="preserve">31,4%</w:t>
+            </w:r>
+          </w:p>
+        </w:tc>
+      </w:tr>
+      <w:tr>
+        <w:tc>
+          <w:tcPr>
+            <w:tcW w:w="4500" w:type="dxa"/>
+            <w:tcBorders>
+              <w:top w:val="single" w:sz="4" w:space="0" w:color="999999"/>
+              <w:left w:val="single" w:sz="4" w:space="0" w:color="999999"/>
+              <w:bottom w:val="single" w:sz="4" w:space="0" w:color="999999"/>
+              <w:right w:val="single" w:sz="4" w:space="0" w:color="999999"/>
+            </w:tcBorders>
+            <w:vAlign w:val="center"/>
+          </w:tcPr>
+          <w:p>
+            <w:pPr>
+              <w:spacing w:after="0" w:line="259" w:lineRule="auto"/>
+              <w:rPr>
+                <w:rFonts w:ascii="Raleway" w:cs="Raleway" w:eastAsia="Raleway" w:hAnsi="Raleway"/>
+                <w:sz w:val="22"/>
+                <w:szCs w:val="22"/>
+              </w:rPr>
+            </w:pPr>
+            <w:r>
+              <w:rPr>
+                <w:rFonts w:ascii="Raleway" w:cs="Raleway" w:eastAsia="Raleway" w:hAnsi="Raleway"/>
+                <w:sz w:val="22"/>
+                <w:szCs w:val="22"/>
+                <w:rtl w:val="0"/>
+              </w:rPr>
+              <w:t xml:space="preserve">45 a 64 años</w:t>
+            </w:r>
+          </w:p>
+        </w:tc>
+        <w:tc>
+          <w:tcPr>
+            <w:tcW w:w="2000" w:type="dxa"/>
+            <w:tcBorders>
+              <w:top w:val="single" w:sz="4" w:space="0" w:color="999999"/>
+              <w:left w:val="single" w:sz="4" w:space="0" w:color="999999"/>
+              <w:bottom w:val="single" w:sz="4" w:space="0" w:color="999999"/>
+              <w:right w:val="single" w:sz="4" w:space="0" w:color="999999"/>
+            </w:tcBorders>
+            <w:vAlign w:val="center"/>
+          </w:tcPr>
+          <w:p>
+            <w:pPr>
+              <w:spacing w:after="0" w:line="259" w:lineRule="auto"/>
+              <w:rPr>
+                <w:rFonts w:ascii="Raleway" w:cs="Raleway" w:eastAsia="Raleway" w:hAnsi="Raleway"/>
+                <w:sz w:val="22"/>
+                <w:szCs w:val="22"/>
+              </w:rPr>
+            </w:pPr>
+            <w:r>
+              <w:rPr>
+                <w:rFonts w:ascii="Raleway" w:cs="Raleway" w:eastAsia="Raleway" w:hAnsi="Raleway"/>
+                <w:sz w:val="22"/>
+                <w:szCs w:val="22"/>
+                <w:rtl w:val="0"/>
+              </w:rPr>
+              <w:t xml:space="preserve">31.857</w:t>
+            </w:r>
+          </w:p>
+        </w:tc>
+        <w:tc>
+          <w:tcPr>
+            <w:tcW w:w="2000" w:type="dxa"/>
+            <w:tcBorders>
+              <w:top w:val="single" w:sz="4" w:space="0" w:color="999999"/>
+              <w:left w:val="single" w:sz="4" w:space="0" w:color="999999"/>
+              <w:bottom w:val="single" w:sz="4" w:space="0" w:color="999999"/>
+              <w:right w:val="single" w:sz="4" w:space="0" w:color="999999"/>
+            </w:tcBorders>
+            <w:vAlign w:val="center"/>
+          </w:tcPr>
+          <w:p>
+            <w:pPr>
+              <w:spacing w:after="0" w:line="259" w:lineRule="auto"/>
+              <w:rPr>
+                <w:rFonts w:ascii="Raleway" w:cs="Raleway" w:eastAsia="Raleway" w:hAnsi="Raleway"/>
+                <w:sz w:val="22"/>
+                <w:szCs w:val="22"/>
+              </w:rPr>
+            </w:pPr>
+            <w:r>
+              <w:rPr>
+                <w:rFonts w:ascii="Raleway" w:cs="Raleway" w:eastAsia="Raleway" w:hAnsi="Raleway"/>
+                <w:sz w:val="22"/>
+                <w:szCs w:val="22"/>
+                <w:rtl w:val="0"/>
+              </w:rPr>
+              <w:t xml:space="preserve">22,1%</w:t>
+            </w:r>
+          </w:p>
+        </w:tc>
+      </w:tr>
+      <w:tr>
+        <w:tc>
+          <w:tcPr>
+            <w:tcW w:w="4500" w:type="dxa"/>
+            <w:tcBorders>
+              <w:top w:val="single" w:sz="4" w:space="0" w:color="999999"/>
+              <w:left w:val="single" w:sz="4" w:space="0" w:color="999999"/>
+              <w:bottom w:val="single" w:sz="4" w:space="0" w:color="999999"/>
+              <w:right w:val="single" w:sz="4" w:space="0" w:color="999999"/>
+            </w:tcBorders>
+            <w:vAlign w:val="center"/>
+          </w:tcPr>
+          <w:p>
+            <w:pPr>
+              <w:spacing w:after="0" w:line="259" w:lineRule="auto"/>
+              <w:rPr>
+                <w:rFonts w:ascii="Raleway" w:cs="Raleway" w:eastAsia="Raleway" w:hAnsi="Raleway"/>
+                <w:sz w:val="22"/>
+                <w:szCs w:val="22"/>
+              </w:rPr>
+            </w:pPr>
+            <w:r>
+              <w:rPr>
+                <w:rFonts w:ascii="Raleway" w:cs="Raleway" w:eastAsia="Raleway" w:hAnsi="Raleway"/>
+                <w:sz w:val="22"/>
+                <w:szCs w:val="22"/>
+                <w:rtl w:val="0"/>
+              </w:rPr>
+              <w:t xml:space="preserve">65 años y más (Mayores)</w:t>
+            </w:r>
+          </w:p>
+        </w:tc>
+        <w:tc>
+          <w:tcPr>
+            <w:tcW w:w="2000" w:type="dxa"/>
+            <w:tcBorders>
+              <w:top w:val="single" w:sz="4" w:space="0" w:color="999999"/>
+              <w:left w:val="single" w:sz="4" w:space="0" w:color="999999"/>
+              <w:bottom w:val="single" w:sz="4" w:space="0" w:color="999999"/>
+              <w:right w:val="single" w:sz="4" w:space="0" w:color="999999"/>
+            </w:tcBorders>
+            <w:vAlign w:val="center"/>
+          </w:tcPr>
+          <w:p>
+            <w:pPr>
+              <w:spacing w:after="0" w:line="259" w:lineRule="auto"/>
+              <w:rPr>
+                <w:rFonts w:ascii="Raleway" w:cs="Raleway" w:eastAsia="Raleway" w:hAnsi="Raleway"/>
+                <w:sz w:val="22"/>
+                <w:szCs w:val="22"/>
+              </w:rPr>
+            </w:pPr>
+            <w:r>
+              <w:rPr>
+                <w:rFonts w:ascii="Raleway" w:cs="Raleway" w:eastAsia="Raleway" w:hAnsi="Raleway"/>
+                <w:sz w:val="22"/>
+                <w:szCs w:val="22"/>
+                <w:rtl w:val="0"/>
+              </w:rPr>
+              <w:t xml:space="preserve">23.105</w:t>
+            </w:r>
+          </w:p>
+        </w:tc>
+        <w:tc>
+          <w:tcPr>
+            <w:tcW w:w="2000" w:type="dxa"/>
+            <w:tcBorders>
+              <w:top w:val="single" w:sz="4" w:space="0" w:color="999999"/>
+              <w:left w:val="single" w:sz="4" w:space="0" w:color="999999"/>
+              <w:bottom w:val="single" w:sz="4" w:space="0" w:color="999999"/>
+              <w:right w:val="single" w:sz="4" w:space="0" w:color="999999"/>
+            </w:tcBorders>
+            <w:vAlign w:val="center"/>
+          </w:tcPr>
+          <w:p>
+            <w:pPr>
+              <w:spacing w:after="0" w:line="259" w:lineRule="auto"/>
+              <w:rPr>
+                <w:rFonts w:ascii="Raleway" w:cs="Raleway" w:eastAsia="Raleway" w:hAnsi="Raleway"/>
+                <w:sz w:val="22"/>
+                <w:szCs w:val="22"/>
+              </w:rPr>
+            </w:pPr>
+            <w:r>
+              <w:rPr>
+                <w:rFonts w:ascii="Raleway" w:cs="Raleway" w:eastAsia="Raleway" w:hAnsi="Raleway"/>
+                <w:sz w:val="22"/>
+                <w:szCs w:val="22"/>
+                <w:rtl w:val="0"/>
+              </w:rPr>
+              <w:t xml:space="preserve">16,0%</w:t>
+            </w:r>
+          </w:p>
+        </w:tc>
+      </w:tr>
+    </w:tbl>
+    <w:p>
+      <w:pPr>
+        <w:spacing w:after="80" w:line="259" w:lineRule="auto"/>
+        <w:rPr>
+          <w:rFonts w:ascii="Raleway" w:cs="Raleway" w:eastAsia="Raleway" w:hAnsi="Raleway"/>
+          <w:sz w:val="22"/>
+          <w:szCs w:val="22"/>
+        </w:rPr>
+      </w:pPr>
+      <w:r>
+        <w:rPr>
+          <w:rFonts w:ascii="Raleway" w:cs="Raleway" w:eastAsia="Raleway" w:hAnsi="Raleway"/>
+          <w:sz w:val="22"/>
+          <w:szCs w:val="22"/>
+          <w:rtl w:val="0"/>
+        </w:rPr>
+        <w:t xml:space="preserve"/>
       </w:r>
     </w:p>
     <w:p>

</xml_diff>

<commit_message>
Replace the age-distribution table with the actual pie chart
Renders the same 5-wedge chart from slide 8 (matplotlib, matching
the deck's exact colors/labels/percentages, Raleway font) and
embeds it as an image in section 4, in place of the plain table.

Co-Authored-By: Claude Sonnet 5 <noreply@anthropic.com>
Claude-Session: https://claude.ai/code/session_01UCEkpXJeXiJNdtVTMN97wz
</commit_message>
<xml_diff>
--- a/Minuta_Agenda_Intergeneracional.docx
+++ b/Minuta_Agenda_Intergeneracional.docx
@@ -716,621 +716,47 @@
         <w:t xml:space="preserve">Cifras clave — distribución de la población por tramo de edad (Censo 2024, Providencia):</w:t>
       </w:r>
     </w:p>
-    <w:tbl>
-      <w:tblPr>
-        <w:tblW w:w="8500" w:type="dxa"/>
-        <w:tblBorders>
-          <w:top w:val="single" w:sz="4" w:space="0" w:color="999999"/>
-          <w:left w:val="single" w:sz="4" w:space="0" w:color="999999"/>
-          <w:bottom w:val="single" w:sz="4" w:space="0" w:color="999999"/>
-          <w:right w:val="single" w:sz="4" w:space="0" w:color="999999"/>
-          <w:insideH w:val="single" w:sz="4" w:space="0" w:color="999999"/>
-          <w:insideV w:val="single" w:sz="4" w:space="0" w:color="999999"/>
-        </w:tblBorders>
-        <w:tblLook w:val="0000" w:firstRow="0" w:lastRow="0" w:firstColumn="0" w:lastColumn="0" w:noHBand="0" w:noVBand="0"/>
-      </w:tblPr>
-      <w:tblGrid>
-        <w:gridCol w:w="4500"/>
-        <w:gridCol w:w="2000"/>
-        <w:gridCol w:w="2000"/>
-      </w:tblGrid>
-      <w:tr>
-        <w:tc>
-          <w:tcPr>
-            <w:tcW w:w="4500" w:type="dxa"/>
-            <w:tcBorders>
-              <w:top w:val="single" w:sz="4" w:space="0" w:color="999999"/>
-              <w:left w:val="single" w:sz="4" w:space="0" w:color="999999"/>
-              <w:bottom w:val="single" w:sz="4" w:space="0" w:color="999999"/>
-              <w:right w:val="single" w:sz="4" w:space="0" w:color="999999"/>
-            </w:tcBorders>
-            <w:shd w:val="clear" w:color="auto" w:fill="EAE0D0"/>
-            <w:vAlign w:val="center"/>
-          </w:tcPr>
-          <w:p>
-            <w:pPr>
-              <w:spacing w:after="0" w:line="259" w:lineRule="auto"/>
-              <w:rPr>
-                <w:rFonts w:ascii="Raleway" w:cs="Raleway" w:eastAsia="Raleway" w:hAnsi="Raleway"/>
-                <w:sz w:val="22"/>
-                <w:szCs w:val="22"/>
-              </w:rPr>
-            </w:pPr>
-            <w:r>
-              <w:rPr>
-                <w:rFonts w:ascii="Raleway" w:cs="Raleway" w:eastAsia="Raleway" w:hAnsi="Raleway"/>
-                <w:b w:val="1"/>
-                <w:bCs w:val="1"/>
-                <w:sz w:val="22"/>
-                <w:szCs w:val="22"/>
-                <w:rtl w:val="0"/>
-              </w:rPr>
-              <w:t xml:space="preserve">Tramo etario</w:t>
-            </w:r>
-          </w:p>
-        </w:tc>
-        <w:tc>
-          <w:tcPr>
-            <w:tcW w:w="2000" w:type="dxa"/>
-            <w:tcBorders>
-              <w:top w:val="single" w:sz="4" w:space="0" w:color="999999"/>
-              <w:left w:val="single" w:sz="4" w:space="0" w:color="999999"/>
-              <w:bottom w:val="single" w:sz="4" w:space="0" w:color="999999"/>
-              <w:right w:val="single" w:sz="4" w:space="0" w:color="999999"/>
-            </w:tcBorders>
-            <w:shd w:val="clear" w:color="auto" w:fill="EAE0D0"/>
-            <w:vAlign w:val="center"/>
-          </w:tcPr>
-          <w:p>
-            <w:pPr>
-              <w:spacing w:after="0" w:line="259" w:lineRule="auto"/>
-              <w:rPr>
-                <w:rFonts w:ascii="Raleway" w:cs="Raleway" w:eastAsia="Raleway" w:hAnsi="Raleway"/>
-                <w:sz w:val="22"/>
-                <w:szCs w:val="22"/>
-              </w:rPr>
-            </w:pPr>
-            <w:r>
-              <w:rPr>
-                <w:rFonts w:ascii="Raleway" w:cs="Raleway" w:eastAsia="Raleway" w:hAnsi="Raleway"/>
-                <w:b w:val="1"/>
-                <w:bCs w:val="1"/>
-                <w:sz w:val="22"/>
-                <w:szCs w:val="22"/>
-                <w:rtl w:val="0"/>
-              </w:rPr>
-              <w:t xml:space="preserve">Población</w:t>
-            </w:r>
-          </w:p>
-        </w:tc>
-        <w:tc>
-          <w:tcPr>
-            <w:tcW w:w="2000" w:type="dxa"/>
-            <w:tcBorders>
-              <w:top w:val="single" w:sz="4" w:space="0" w:color="999999"/>
-              <w:left w:val="single" w:sz="4" w:space="0" w:color="999999"/>
-              <w:bottom w:val="single" w:sz="4" w:space="0" w:color="999999"/>
-              <w:right w:val="single" w:sz="4" w:space="0" w:color="999999"/>
-            </w:tcBorders>
-            <w:shd w:val="clear" w:color="auto" w:fill="EAE0D0"/>
-            <w:vAlign w:val="center"/>
-          </w:tcPr>
-          <w:p>
-            <w:pPr>
-              <w:spacing w:after="0" w:line="259" w:lineRule="auto"/>
-              <w:rPr>
-                <w:rFonts w:ascii="Raleway" w:cs="Raleway" w:eastAsia="Raleway" w:hAnsi="Raleway"/>
-                <w:sz w:val="22"/>
-                <w:szCs w:val="22"/>
-              </w:rPr>
-            </w:pPr>
-            <w:r>
-              <w:rPr>
-                <w:rFonts w:ascii="Raleway" w:cs="Raleway" w:eastAsia="Raleway" w:hAnsi="Raleway"/>
-                <w:b w:val="1"/>
-                <w:bCs w:val="1"/>
-                <w:sz w:val="22"/>
-                <w:szCs w:val="22"/>
-                <w:rtl w:val="0"/>
-              </w:rPr>
-              <w:t xml:space="preserve">Porcentaje</w:t>
-            </w:r>
-          </w:p>
-        </w:tc>
-      </w:tr>
-      <w:tr>
-        <w:tc>
-          <w:tcPr>
-            <w:tcW w:w="4500" w:type="dxa"/>
-            <w:tcBorders>
-              <w:top w:val="single" w:sz="4" w:space="0" w:color="999999"/>
-              <w:left w:val="single" w:sz="4" w:space="0" w:color="999999"/>
-              <w:bottom w:val="single" w:sz="4" w:space="0" w:color="999999"/>
-              <w:right w:val="single" w:sz="4" w:space="0" w:color="999999"/>
-            </w:tcBorders>
-            <w:vAlign w:val="center"/>
-          </w:tcPr>
-          <w:p>
-            <w:pPr>
-              <w:spacing w:after="0" w:line="259" w:lineRule="auto"/>
-              <w:rPr>
-                <w:rFonts w:ascii="Raleway" w:cs="Raleway" w:eastAsia="Raleway" w:hAnsi="Raleway"/>
-                <w:sz w:val="22"/>
-                <w:szCs w:val="22"/>
-              </w:rPr>
-            </w:pPr>
-            <w:r>
-              <w:rPr>
-                <w:rFonts w:ascii="Raleway" w:cs="Raleway" w:eastAsia="Raleway" w:hAnsi="Raleway"/>
-                <w:sz w:val="22"/>
-                <w:szCs w:val="22"/>
-                <w:rtl w:val="0"/>
-              </w:rPr>
-              <w:t xml:space="preserve">0 a 14 años</w:t>
-            </w:r>
-          </w:p>
-        </w:tc>
-        <w:tc>
-          <w:tcPr>
-            <w:tcW w:w="2000" w:type="dxa"/>
-            <w:tcBorders>
-              <w:top w:val="single" w:sz="4" w:space="0" w:color="999999"/>
-              <w:left w:val="single" w:sz="4" w:space="0" w:color="999999"/>
-              <w:bottom w:val="single" w:sz="4" w:space="0" w:color="999999"/>
-              <w:right w:val="single" w:sz="4" w:space="0" w:color="999999"/>
-            </w:tcBorders>
-            <w:vAlign w:val="center"/>
-          </w:tcPr>
-          <w:p>
-            <w:pPr>
-              <w:spacing w:after="0" w:line="259" w:lineRule="auto"/>
-              <w:rPr>
-                <w:rFonts w:ascii="Raleway" w:cs="Raleway" w:eastAsia="Raleway" w:hAnsi="Raleway"/>
-                <w:sz w:val="22"/>
-                <w:szCs w:val="22"/>
-              </w:rPr>
-            </w:pPr>
-            <w:r>
-              <w:rPr>
-                <w:rFonts w:ascii="Raleway" w:cs="Raleway" w:eastAsia="Raleway" w:hAnsi="Raleway"/>
-                <w:sz w:val="22"/>
-                <w:szCs w:val="22"/>
-                <w:rtl w:val="0"/>
-              </w:rPr>
-              <w:t xml:space="preserve">17.123</w:t>
-            </w:r>
-          </w:p>
-        </w:tc>
-        <w:tc>
-          <w:tcPr>
-            <w:tcW w:w="2000" w:type="dxa"/>
-            <w:tcBorders>
-              <w:top w:val="single" w:sz="4" w:space="0" w:color="999999"/>
-              <w:left w:val="single" w:sz="4" w:space="0" w:color="999999"/>
-              <w:bottom w:val="single" w:sz="4" w:space="0" w:color="999999"/>
-              <w:right w:val="single" w:sz="4" w:space="0" w:color="999999"/>
-            </w:tcBorders>
-            <w:vAlign w:val="center"/>
-          </w:tcPr>
-          <w:p>
-            <w:pPr>
-              <w:spacing w:after="0" w:line="259" w:lineRule="auto"/>
-              <w:rPr>
-                <w:rFonts w:ascii="Raleway" w:cs="Raleway" w:eastAsia="Raleway" w:hAnsi="Raleway"/>
-                <w:sz w:val="22"/>
-                <w:szCs w:val="22"/>
-              </w:rPr>
-            </w:pPr>
-            <w:r>
-              <w:rPr>
-                <w:rFonts w:ascii="Raleway" w:cs="Raleway" w:eastAsia="Raleway" w:hAnsi="Raleway"/>
-                <w:sz w:val="22"/>
-                <w:szCs w:val="22"/>
-                <w:rtl w:val="0"/>
-              </w:rPr>
-              <w:t xml:space="preserve">11,9%</w:t>
-            </w:r>
-          </w:p>
-        </w:tc>
-      </w:tr>
-      <w:tr>
-        <w:tc>
-          <w:tcPr>
-            <w:tcW w:w="4500" w:type="dxa"/>
-            <w:tcBorders>
-              <w:top w:val="single" w:sz="4" w:space="0" w:color="999999"/>
-              <w:left w:val="single" w:sz="4" w:space="0" w:color="999999"/>
-              <w:bottom w:val="single" w:sz="4" w:space="0" w:color="999999"/>
-              <w:right w:val="single" w:sz="4" w:space="0" w:color="999999"/>
-            </w:tcBorders>
-            <w:vAlign w:val="center"/>
-          </w:tcPr>
-          <w:p>
-            <w:pPr>
-              <w:spacing w:after="0" w:line="259" w:lineRule="auto"/>
-              <w:rPr>
-                <w:rFonts w:ascii="Raleway" w:cs="Raleway" w:eastAsia="Raleway" w:hAnsi="Raleway"/>
-                <w:sz w:val="22"/>
-                <w:szCs w:val="22"/>
-              </w:rPr>
-            </w:pPr>
-            <w:r>
-              <w:rPr>
-                <w:rFonts w:ascii="Raleway" w:cs="Raleway" w:eastAsia="Raleway" w:hAnsi="Raleway"/>
-                <w:sz w:val="22"/>
-                <w:szCs w:val="22"/>
-                <w:rtl w:val="0"/>
-              </w:rPr>
-              <w:t xml:space="preserve">15 a 29 años (Jóvenes)</w:t>
-            </w:r>
-          </w:p>
-        </w:tc>
-        <w:tc>
-          <w:tcPr>
-            <w:tcW w:w="2000" w:type="dxa"/>
-            <w:tcBorders>
-              <w:top w:val="single" w:sz="4" w:space="0" w:color="999999"/>
-              <w:left w:val="single" w:sz="4" w:space="0" w:color="999999"/>
-              <w:bottom w:val="single" w:sz="4" w:space="0" w:color="999999"/>
-              <w:right w:val="single" w:sz="4" w:space="0" w:color="999999"/>
-            </w:tcBorders>
-            <w:vAlign w:val="center"/>
-          </w:tcPr>
-          <w:p>
-            <w:pPr>
-              <w:spacing w:after="0" w:line="259" w:lineRule="auto"/>
-              <w:rPr>
-                <w:rFonts w:ascii="Raleway" w:cs="Raleway" w:eastAsia="Raleway" w:hAnsi="Raleway"/>
-                <w:sz w:val="22"/>
-                <w:szCs w:val="22"/>
-              </w:rPr>
-            </w:pPr>
-            <w:r>
-              <w:rPr>
-                <w:rFonts w:ascii="Raleway" w:cs="Raleway" w:eastAsia="Raleway" w:hAnsi="Raleway"/>
-                <w:sz w:val="22"/>
-                <w:szCs w:val="22"/>
-                <w:rtl w:val="0"/>
-              </w:rPr>
-              <w:t xml:space="preserve">26.722</w:t>
-            </w:r>
-          </w:p>
-        </w:tc>
-        <w:tc>
-          <w:tcPr>
-            <w:tcW w:w="2000" w:type="dxa"/>
-            <w:tcBorders>
-              <w:top w:val="single" w:sz="4" w:space="0" w:color="999999"/>
-              <w:left w:val="single" w:sz="4" w:space="0" w:color="999999"/>
-              <w:bottom w:val="single" w:sz="4" w:space="0" w:color="999999"/>
-              <w:right w:val="single" w:sz="4" w:space="0" w:color="999999"/>
-            </w:tcBorders>
-            <w:vAlign w:val="center"/>
-          </w:tcPr>
-          <w:p>
-            <w:pPr>
-              <w:spacing w:after="0" w:line="259" w:lineRule="auto"/>
-              <w:rPr>
-                <w:rFonts w:ascii="Raleway" w:cs="Raleway" w:eastAsia="Raleway" w:hAnsi="Raleway"/>
-                <w:sz w:val="22"/>
-                <w:szCs w:val="22"/>
-              </w:rPr>
-            </w:pPr>
-            <w:r>
-              <w:rPr>
-                <w:rFonts w:ascii="Raleway" w:cs="Raleway" w:eastAsia="Raleway" w:hAnsi="Raleway"/>
-                <w:sz w:val="22"/>
-                <w:szCs w:val="22"/>
-                <w:rtl w:val="0"/>
-              </w:rPr>
-              <w:t xml:space="preserve">18,6%</w:t>
-            </w:r>
-          </w:p>
-        </w:tc>
-      </w:tr>
-      <w:tr>
-        <w:tc>
-          <w:tcPr>
-            <w:tcW w:w="4500" w:type="dxa"/>
-            <w:tcBorders>
-              <w:top w:val="single" w:sz="4" w:space="0" w:color="999999"/>
-              <w:left w:val="single" w:sz="4" w:space="0" w:color="999999"/>
-              <w:bottom w:val="single" w:sz="4" w:space="0" w:color="999999"/>
-              <w:right w:val="single" w:sz="4" w:space="0" w:color="999999"/>
-            </w:tcBorders>
-            <w:vAlign w:val="center"/>
-          </w:tcPr>
-          <w:p>
-            <w:pPr>
-              <w:spacing w:after="0" w:line="259" w:lineRule="auto"/>
-              <w:rPr>
-                <w:rFonts w:ascii="Raleway" w:cs="Raleway" w:eastAsia="Raleway" w:hAnsi="Raleway"/>
-                <w:sz w:val="22"/>
-                <w:szCs w:val="22"/>
-              </w:rPr>
-            </w:pPr>
-            <w:r>
-              <w:rPr>
-                <w:rFonts w:ascii="Raleway" w:cs="Raleway" w:eastAsia="Raleway" w:hAnsi="Raleway"/>
-                <w:sz w:val="22"/>
-                <w:szCs w:val="22"/>
-                <w:rtl w:val="0"/>
-              </w:rPr>
-              <w:t xml:space="preserve">30 a 44 años</w:t>
-            </w:r>
-          </w:p>
-        </w:tc>
-        <w:tc>
-          <w:tcPr>
-            <w:tcW w:w="2000" w:type="dxa"/>
-            <w:tcBorders>
-              <w:top w:val="single" w:sz="4" w:space="0" w:color="999999"/>
-              <w:left w:val="single" w:sz="4" w:space="0" w:color="999999"/>
-              <w:bottom w:val="single" w:sz="4" w:space="0" w:color="999999"/>
-              <w:right w:val="single" w:sz="4" w:space="0" w:color="999999"/>
-            </w:tcBorders>
-            <w:vAlign w:val="center"/>
-          </w:tcPr>
-          <w:p>
-            <w:pPr>
-              <w:spacing w:after="0" w:line="259" w:lineRule="auto"/>
-              <w:rPr>
-                <w:rFonts w:ascii="Raleway" w:cs="Raleway" w:eastAsia="Raleway" w:hAnsi="Raleway"/>
-                <w:sz w:val="22"/>
-                <w:szCs w:val="22"/>
-              </w:rPr>
-            </w:pPr>
-            <w:r>
-              <w:rPr>
-                <w:rFonts w:ascii="Raleway" w:cs="Raleway" w:eastAsia="Raleway" w:hAnsi="Raleway"/>
-                <w:sz w:val="22"/>
-                <w:szCs w:val="22"/>
-                <w:rtl w:val="0"/>
-              </w:rPr>
-              <w:t xml:space="preserve">45.167</w:t>
-            </w:r>
-          </w:p>
-        </w:tc>
-        <w:tc>
-          <w:tcPr>
-            <w:tcW w:w="2000" w:type="dxa"/>
-            <w:tcBorders>
-              <w:top w:val="single" w:sz="4" w:space="0" w:color="999999"/>
-              <w:left w:val="single" w:sz="4" w:space="0" w:color="999999"/>
-              <w:bottom w:val="single" w:sz="4" w:space="0" w:color="999999"/>
-              <w:right w:val="single" w:sz="4" w:space="0" w:color="999999"/>
-            </w:tcBorders>
-            <w:vAlign w:val="center"/>
-          </w:tcPr>
-          <w:p>
-            <w:pPr>
-              <w:spacing w:after="0" w:line="259" w:lineRule="auto"/>
-              <w:rPr>
-                <w:rFonts w:ascii="Raleway" w:cs="Raleway" w:eastAsia="Raleway" w:hAnsi="Raleway"/>
-                <w:sz w:val="22"/>
-                <w:szCs w:val="22"/>
-              </w:rPr>
-            </w:pPr>
-            <w:r>
-              <w:rPr>
-                <w:rFonts w:ascii="Raleway" w:cs="Raleway" w:eastAsia="Raleway" w:hAnsi="Raleway"/>
-                <w:sz w:val="22"/>
-                <w:szCs w:val="22"/>
-                <w:rtl w:val="0"/>
-              </w:rPr>
-              <w:t xml:space="preserve">31,4%</w:t>
-            </w:r>
-          </w:p>
-        </w:tc>
-      </w:tr>
-      <w:tr>
-        <w:tc>
-          <w:tcPr>
-            <w:tcW w:w="4500" w:type="dxa"/>
-            <w:tcBorders>
-              <w:top w:val="single" w:sz="4" w:space="0" w:color="999999"/>
-              <w:left w:val="single" w:sz="4" w:space="0" w:color="999999"/>
-              <w:bottom w:val="single" w:sz="4" w:space="0" w:color="999999"/>
-              <w:right w:val="single" w:sz="4" w:space="0" w:color="999999"/>
-            </w:tcBorders>
-            <w:vAlign w:val="center"/>
-          </w:tcPr>
-          <w:p>
-            <w:pPr>
-              <w:spacing w:after="0" w:line="259" w:lineRule="auto"/>
-              <w:rPr>
-                <w:rFonts w:ascii="Raleway" w:cs="Raleway" w:eastAsia="Raleway" w:hAnsi="Raleway"/>
-                <w:sz w:val="22"/>
-                <w:szCs w:val="22"/>
-              </w:rPr>
-            </w:pPr>
-            <w:r>
-              <w:rPr>
-                <w:rFonts w:ascii="Raleway" w:cs="Raleway" w:eastAsia="Raleway" w:hAnsi="Raleway"/>
-                <w:sz w:val="22"/>
-                <w:szCs w:val="22"/>
-                <w:rtl w:val="0"/>
-              </w:rPr>
-              <w:t xml:space="preserve">45 a 64 años</w:t>
-            </w:r>
-          </w:p>
-        </w:tc>
-        <w:tc>
-          <w:tcPr>
-            <w:tcW w:w="2000" w:type="dxa"/>
-            <w:tcBorders>
-              <w:top w:val="single" w:sz="4" w:space="0" w:color="999999"/>
-              <w:left w:val="single" w:sz="4" w:space="0" w:color="999999"/>
-              <w:bottom w:val="single" w:sz="4" w:space="0" w:color="999999"/>
-              <w:right w:val="single" w:sz="4" w:space="0" w:color="999999"/>
-            </w:tcBorders>
-            <w:vAlign w:val="center"/>
-          </w:tcPr>
-          <w:p>
-            <w:pPr>
-              <w:spacing w:after="0" w:line="259" w:lineRule="auto"/>
-              <w:rPr>
-                <w:rFonts w:ascii="Raleway" w:cs="Raleway" w:eastAsia="Raleway" w:hAnsi="Raleway"/>
-                <w:sz w:val="22"/>
-                <w:szCs w:val="22"/>
-              </w:rPr>
-            </w:pPr>
-            <w:r>
-              <w:rPr>
-                <w:rFonts w:ascii="Raleway" w:cs="Raleway" w:eastAsia="Raleway" w:hAnsi="Raleway"/>
-                <w:sz w:val="22"/>
-                <w:szCs w:val="22"/>
-                <w:rtl w:val="0"/>
-              </w:rPr>
-              <w:t xml:space="preserve">31.857</w:t>
-            </w:r>
-          </w:p>
-        </w:tc>
-        <w:tc>
-          <w:tcPr>
-            <w:tcW w:w="2000" w:type="dxa"/>
-            <w:tcBorders>
-              <w:top w:val="single" w:sz="4" w:space="0" w:color="999999"/>
-              <w:left w:val="single" w:sz="4" w:space="0" w:color="999999"/>
-              <w:bottom w:val="single" w:sz="4" w:space="0" w:color="999999"/>
-              <w:right w:val="single" w:sz="4" w:space="0" w:color="999999"/>
-            </w:tcBorders>
-            <w:vAlign w:val="center"/>
-          </w:tcPr>
-          <w:p>
-            <w:pPr>
-              <w:spacing w:after="0" w:line="259" w:lineRule="auto"/>
-              <w:rPr>
-                <w:rFonts w:ascii="Raleway" w:cs="Raleway" w:eastAsia="Raleway" w:hAnsi="Raleway"/>
-                <w:sz w:val="22"/>
-                <w:szCs w:val="22"/>
-              </w:rPr>
-            </w:pPr>
-            <w:r>
-              <w:rPr>
-                <w:rFonts w:ascii="Raleway" w:cs="Raleway" w:eastAsia="Raleway" w:hAnsi="Raleway"/>
-                <w:sz w:val="22"/>
-                <w:szCs w:val="22"/>
-                <w:rtl w:val="0"/>
-              </w:rPr>
-              <w:t xml:space="preserve">22,1%</w:t>
-            </w:r>
-          </w:p>
-        </w:tc>
-      </w:tr>
-      <w:tr>
-        <w:tc>
-          <w:tcPr>
-            <w:tcW w:w="4500" w:type="dxa"/>
-            <w:tcBorders>
-              <w:top w:val="single" w:sz="4" w:space="0" w:color="999999"/>
-              <w:left w:val="single" w:sz="4" w:space="0" w:color="999999"/>
-              <w:bottom w:val="single" w:sz="4" w:space="0" w:color="999999"/>
-              <w:right w:val="single" w:sz="4" w:space="0" w:color="999999"/>
-            </w:tcBorders>
-            <w:vAlign w:val="center"/>
-          </w:tcPr>
-          <w:p>
-            <w:pPr>
-              <w:spacing w:after="0" w:line="259" w:lineRule="auto"/>
-              <w:rPr>
-                <w:rFonts w:ascii="Raleway" w:cs="Raleway" w:eastAsia="Raleway" w:hAnsi="Raleway"/>
-                <w:sz w:val="22"/>
-                <w:szCs w:val="22"/>
-              </w:rPr>
-            </w:pPr>
-            <w:r>
-              <w:rPr>
-                <w:rFonts w:ascii="Raleway" w:cs="Raleway" w:eastAsia="Raleway" w:hAnsi="Raleway"/>
-                <w:sz w:val="22"/>
-                <w:szCs w:val="22"/>
-                <w:rtl w:val="0"/>
-              </w:rPr>
-              <w:t xml:space="preserve">65 años y más (Mayores)</w:t>
-            </w:r>
-          </w:p>
-        </w:tc>
-        <w:tc>
-          <w:tcPr>
-            <w:tcW w:w="2000" w:type="dxa"/>
-            <w:tcBorders>
-              <w:top w:val="single" w:sz="4" w:space="0" w:color="999999"/>
-              <w:left w:val="single" w:sz="4" w:space="0" w:color="999999"/>
-              <w:bottom w:val="single" w:sz="4" w:space="0" w:color="999999"/>
-              <w:right w:val="single" w:sz="4" w:space="0" w:color="999999"/>
-            </w:tcBorders>
-            <w:vAlign w:val="center"/>
-          </w:tcPr>
-          <w:p>
-            <w:pPr>
-              <w:spacing w:after="0" w:line="259" w:lineRule="auto"/>
-              <w:rPr>
-                <w:rFonts w:ascii="Raleway" w:cs="Raleway" w:eastAsia="Raleway" w:hAnsi="Raleway"/>
-                <w:sz w:val="22"/>
-                <w:szCs w:val="22"/>
-              </w:rPr>
-            </w:pPr>
-            <w:r>
-              <w:rPr>
-                <w:rFonts w:ascii="Raleway" w:cs="Raleway" w:eastAsia="Raleway" w:hAnsi="Raleway"/>
-                <w:sz w:val="22"/>
-                <w:szCs w:val="22"/>
-                <w:rtl w:val="0"/>
-              </w:rPr>
-              <w:t xml:space="preserve">23.105</w:t>
-            </w:r>
-          </w:p>
-        </w:tc>
-        <w:tc>
-          <w:tcPr>
-            <w:tcW w:w="2000" w:type="dxa"/>
-            <w:tcBorders>
-              <w:top w:val="single" w:sz="4" w:space="0" w:color="999999"/>
-              <w:left w:val="single" w:sz="4" w:space="0" w:color="999999"/>
-              <w:bottom w:val="single" w:sz="4" w:space="0" w:color="999999"/>
-              <w:right w:val="single" w:sz="4" w:space="0" w:color="999999"/>
-            </w:tcBorders>
-            <w:vAlign w:val="center"/>
-          </w:tcPr>
-          <w:p>
-            <w:pPr>
-              <w:spacing w:after="0" w:line="259" w:lineRule="auto"/>
-              <w:rPr>
-                <w:rFonts w:ascii="Raleway" w:cs="Raleway" w:eastAsia="Raleway" w:hAnsi="Raleway"/>
-                <w:sz w:val="22"/>
-                <w:szCs w:val="22"/>
-              </w:rPr>
-            </w:pPr>
-            <w:r>
-              <w:rPr>
-                <w:rFonts w:ascii="Raleway" w:cs="Raleway" w:eastAsia="Raleway" w:hAnsi="Raleway"/>
-                <w:sz w:val="22"/>
-                <w:szCs w:val="22"/>
-                <w:rtl w:val="0"/>
-              </w:rPr>
-              <w:t xml:space="preserve">16,0%</w:t>
-            </w:r>
-          </w:p>
-        </w:tc>
-      </w:tr>
-    </w:tbl>
-    <w:p>
-      <w:pPr>
-        <w:spacing w:after="80" w:line="259" w:lineRule="auto"/>
-        <w:rPr>
-          <w:rFonts w:ascii="Raleway" w:cs="Raleway" w:eastAsia="Raleway" w:hAnsi="Raleway"/>
-          <w:sz w:val="22"/>
-          <w:szCs w:val="22"/>
-        </w:rPr>
-      </w:pPr>
-      <w:r>
-        <w:rPr>
-          <w:rFonts w:ascii="Raleway" w:cs="Raleway" w:eastAsia="Raleway" w:hAnsi="Raleway"/>
-          <w:sz w:val="22"/>
-          <w:szCs w:val="22"/>
-          <w:rtl w:val="0"/>
-        </w:rPr>
-        <w:t xml:space="preserve"/>
+    <w:p>
+      <w:pPr>
+        <w:spacing w:after="160"/>
+        <w:jc w:val="center"/>
+      </w:pPr>
+      <w:r>
+        <w:drawing>
+          <wp:inline distT="0" distB="0" distL="0" distR="0">
+            <wp:extent cx="5486400" cy="2987673"/>
+            <wp:effectExtent l="0" t="0" r="0" b="0"/>
+            <wp:docPr id="100" name="Gráfico distribución por tramo de edad"/>
+            <wp:cNvGraphicFramePr>
+              <a:graphicFrameLocks noChangeAspect="1"/>
+            </wp:cNvGraphicFramePr>
+            <a:graphic>
+              <a:graphicData uri="http://schemas.openxmlformats.org/drawingml/2006/picture">
+                <pic:pic>
+                  <pic:nvPicPr>
+                    <pic:cNvPr id="100" name="Gráfico distribución por tramo de edad"/>
+                    <pic:cNvPicPr/>
+                  </pic:nvPicPr>
+                  <pic:blipFill>
+                    <a:blip r:embed="rId8"/>
+                    <a:stretch>
+                      <a:fillRect/>
+                    </a:stretch>
+                  </pic:blipFill>
+                  <pic:spPr>
+                    <a:xfrm>
+                      <a:off x="0" y="0"/>
+                      <a:ext cx="5486400" cy="2987673"/>
+                    </a:xfrm>
+                    <a:prstGeom prst="rect">
+                      <a:avLst/>
+                    </a:prstGeom>
+                  </pic:spPr>
+                </pic:pic>
+              </a:graphicData>
+            </a:graphic>
+          </wp:inline>
+        </w:drawing>
       </w:r>
     </w:p>
     <w:p>

</xml_diff>